<commit_message>
release: v0.8.1 whitepaper — final approved docx
</commit_message>
<xml_diff>
--- a/releases/v0.8.1/EDM_v0_8_1_Whitepaper_Harvey_2026.docx
+++ b/releases/v0.8.1/EDM_v0_8_1_Whitepaper_Harvey_2026.docx
@@ -75,10 +75,7 @@
         <w:t>DOI:</w:t>
       </w:r>
       <w:r>
-        <w:t xml:space="preserve"> </w:t>
-      </w:r>
-      <w:r>
-        <w:t>pending — assigned on Zenodo publication (v0.8.0: 10.5281/zenodo.19555166)</w:t>
+        <w:t xml:space="preserve"> 10.5281/zenodo.TODO (concept: 10.5281/zenodo.17808652)</w:t>
       </w:r>
     </w:p>
     <w:p>
@@ -112,13 +109,7 @@
         <w:t>Emotional Data Model (EDM)</w:t>
       </w:r>
       <w:r>
-        <w:t xml:space="preserve"> addresses this gap by defining a governed, schema-bound representational format that externalises affective context as a deterministic, model-agnostic data object. EDM </w:t>
-      </w:r>
-      <w:r>
-        <w:t>v0.8.0</w:t>
-      </w:r>
-      <w:r>
-        <w:t xml:space="preserve"> specifies domain-complete structures for narrative anchors, affective topology, salience geometry, contextual framing, and in-band governance, ensuring long-range interpretability without reliance on inference or behavioural semantics.</w:t>
+        <w:t xml:space="preserve"> addresses this gap by defining a governed, schema-bound representational format that externalises affective context as a deterministic, model-agnostic data object. EDM v0.8.1 specifies domain-complete structures for narrative anchors, affective topology, salience geometry, contextual framing, and in-band governance, ensuring long-range interpretability without reliance on inference or behavioural semantics.</w:t>
       </w:r>
     </w:p>
     <w:p>
@@ -357,12 +348,6 @@
       <w:r>
         <w:t xml:space="preserve">The Emotional Data Model (EDM) v0.8.1 defines a governed, schema-bound representational architecture for encoding affective context as a stable, machine-interpretable data object. The architecture specifies the complete set of structural domains, serialisation rules, versioning guarantees, and in-band governance requirements necessary to ensure representational fidelity across heterogeneous systems. </w:t>
       </w:r>
-      <w:r>
-        <w:t/>
-      </w:r>
-      <w:r>
-        <w:t xml:space="preserve"/>
-      </w:r>
     </w:p>
     <w:p>
       <w:pPr>
@@ -560,10 +545,7 @@
         <w:jc w:val="both"/>
       </w:pPr>
       <w:r>
-        <w:t xml:space="preserve">1. Architectural Foundations of EDM </w:t>
-      </w:r>
-      <w:r>
-        <w:t>v0.8.1</w:t>
+        <w:t>1. Architectural Foundations of EDM v0.8.1</w:t>
       </w:r>
     </w:p>
     <w:p>
@@ -652,13 +634,7 @@
         <w:t>MUST</w:t>
       </w:r>
       <w:r>
-        <w:t xml:space="preserve"> be encoded as explicit fields within a </w:t>
-      </w:r>
-      <w:r>
-        <w:t>declared profile schema</w:t>
-      </w:r>
-      <w:r>
-        <w:t xml:space="preserve">. No diagnosed, reconstructed, or predictive content is permitted to enter the representational payload; population </w:t>
+        <w:t xml:space="preserve"> be encoded as explicit fields within a declared profile schema. No diagnosed, reconstructed, or predictive content is permitted to enter the representational payload; population </w:t>
       </w:r>
       <w:r>
         <w:rPr>
@@ -750,13 +726,7 @@
         <w:t>Strict Layer Separation:</w:t>
       </w:r>
       <w:r>
-        <w:t xml:space="preserve"> Representation, persistence, and computation act as distinct architectural layers. EDM </w:t>
-      </w:r>
-      <w:r>
-        <w:t>v0.8.1</w:t>
-      </w:r>
-      <w:r>
-        <w:t xml:space="preserve"> defines representational structure only; the .ddna envelope defines persistence and sovereignty only; external systems define computational behaviour only. No layer may redefine the </w:t>
+        <w:t xml:space="preserve"> Representation, persistence, and computation act as distinct architectural layers. EDM v0.8.1 defines representational structure only; the .ddna envelope defines persistence and sovereignty only; external systems define computational behaviour only. No layer may redefine the </w:t>
       </w:r>
       <w:r>
         <w:rPr>
@@ -766,13 +736,7 @@
         <w:t>representational semantics</w:t>
       </w:r>
       <w:r>
-        <w:t xml:space="preserve"> or geometry of another. </w:t>
-      </w:r>
-      <w:r>
-        <w:t>Structural meaning</w:t>
-      </w:r>
-      <w:r>
-        <w:t xml:space="preserve"> </w:t>
+        <w:t xml:space="preserve"> or geometry of another. Structural meaning </w:t>
       </w:r>
       <w:r>
         <w:rPr>
@@ -828,21 +792,7 @@
           <w:b/>
           <w:bCs/>
         </w:rPr>
-        <w:t xml:space="preserve">EDM </w:t>
-      </w:r>
-      <w:r>
-        <w:rPr>
-          <w:b/>
-          <w:bCs/>
-        </w:rPr>
-        <w:t>v0.8.1</w:t>
-      </w:r>
-      <w:r>
-        <w:rPr>
-          <w:b/>
-          <w:bCs/>
-        </w:rPr>
-        <w:t>:</w:t>
+        <w:t>EDM v0.8.1:</w:t>
       </w:r>
       <w:r>
         <w:t xml:space="preserve"> The governed, domain-complete representational schema for affective context.</w:t>
@@ -940,13 +890,7 @@
         <w:jc w:val="both"/>
       </w:pPr>
       <w:r>
-        <w:t xml:space="preserve">The Emotional Data Architecture Stack addresses the absence of an explicit, governed, and structurally stable representation of affective context in contemporary AI systems. Existing architectures provide mechanisms for linguistic transformation, pattern modelling, and multimodal inference, but they do not provide a data-level substrate capable of encoding affective structure as a durable, interpretable, and transportable object. This section situates EDM </w:t>
-      </w:r>
-      <w:r>
-        <w:t>v0.8.0</w:t>
-      </w:r>
-      <w:r>
-        <w:t xml:space="preserve"> and the .ddna envelope within the technical lineage that motivates the need for an externalised representational layer.</w:t>
+        <w:t>The Emotional Data Architecture Stack addresses the absence of an explicit, governed, and structurally stable representation of affective context in contemporary AI systems. Existing architectures provide mechanisms for linguistic transformation, pattern modelling, and multimodal inference, but they do not provide a data-level substrate capable of encoding affective structure as a durable, interpretable, and transportable object. This section situates EDM v0.8.1 and the .ddna envelope within the technical lineage that motivates the need for an externalised representational layer.</w:t>
       </w:r>
     </w:p>
     <w:p>
@@ -1013,13 +957,7 @@
         <w:t>what is significant</w:t>
       </w:r>
       <w:r>
-        <w:t xml:space="preserve">. EDM </w:t>
-      </w:r>
-      <w:r>
-        <w:t>v0.8.0</w:t>
-      </w:r>
-      <w:r>
-        <w:t xml:space="preserve"> resolves this inversion by re-establishing the biological order: it defines a stable, governed representational layer for affect that exists </w:t>
+        <w:t xml:space="preserve">. EDM v0.8.1 resolves this inversion by re-establishing the biological order: it defines a stable, governed representational layer for affect that exists </w:t>
       </w:r>
       <w:r>
         <w:rPr>
@@ -1101,7 +1039,7 @@
       </w:r>
       <w:r>
         <w:lastRenderedPageBreak/>
-        <w:t xml:space="preserve">rights, jurisdiction, retention policy, or consent metadata. Because model-internal structures cannot be stabilised, governed, or externalised, they do not constitute a viable substrate for representational architecture. Recent interpretability work (Sofroniew et al., 2026) provides direct mechanistic evidence for this position: model-internal emotion representations are real, causally influence behaviour, and leave no trace in output text — confirming that affective context cannot be governed at the output layer.</w:t>
+        <w:t>rights, jurisdiction, retention policy, or consent metadata. Because model-internal structures cannot be stabilised, governed, or externalised, they do not constitute a viable substrate for representational architecture.</w:t>
       </w:r>
     </w:p>
     <w:p>
@@ -1169,10 +1107,7 @@
         <w:t xml:space="preserve"> MUST NOT </w:t>
       </w:r>
       <w:r>
-        <w:t>introduce latent reconstruction, psychological inference, or predictive content not grounded in the source</w:t>
-      </w:r>
-      <w:r>
-        <w:t xml:space="preserve">. Furthermore, the architecture requires </w:t>
+        <w:t xml:space="preserve">introduce latent reconstruction, psychological inference, or predictive content not grounded in the source. Furthermore, the architecture requires </w:t>
       </w:r>
       <w:r>
         <w:rPr>
@@ -1220,13 +1155,7 @@
         <w:jc w:val="both"/>
       </w:pPr>
       <w:r>
-        <w:t xml:space="preserve">EDM </w:t>
-      </w:r>
-      <w:r>
-        <w:t>v0.8.1</w:t>
-      </w:r>
-      <w:r>
-        <w:t xml:space="preserve"> draws architectural precedent from established representational systems without inheriting their specific semantics. It builds upon the tradition of structured augmentation systems established by Bush, Engelbart, and Berners-Lee, which demonstrated the necessity of addressable, governed data layers. It also aligns with schema-first interoperability frameworks such as JSON-LD and HL7 FHIR, which establish that governed, domain-complete schemas are essential for long-range interoperability across heterogeneous vendors. Crucially, the protocol’s sovereignty model draws architectural inspiration from W3C Verifiable Credentials (VCs) and Decentralized Identifiers (DIDs), adopting the principle of cryptographically separating the subject (User) from the issuer (System) to ensure portable, user-centric control over sensitive claims.</w:t>
+        <w:t>EDM v0.8.1 draws architectural precedent from established representational systems without inheriting their specific semantics. It builds upon the tradition of structured augmentation systems established by Bush, Engelbart, and Berners-Lee, which demonstrated the necessity of addressable, governed data layers. It also aligns with schema-first interoperability frameworks such as JSON-LD and HL7 FHIR, which establish that governed, domain-complete schemas are essential for long-range interoperability across heterogeneous vendors. Crucially, the protocol’s sovereignty model draws architectural inspiration from W3C Verifiable Credentials (VCs) and Decentralized Identifiers (DIDs), adopting the principle of cryptographically separating the subject (User) from the issuer (System) to ensure portable, user-centric control over sensitive claims.</w:t>
       </w:r>
     </w:p>
     <w:p>
@@ -1244,10 +1173,7 @@
         <w:jc w:val="both"/>
       </w:pPr>
       <w:r>
-        <w:t>Despite these precedents, existing memory systems in AI—including vector stores, RAG pipelines, and proprietary caches—lack essential representational capabilities for affect. They fail to provide explicit affective representation, rights-bearing metadata, persistent salience descriptors, or transportable interpretability. EDM addresses these gaps by defining a governed, schema-complete, model-neutral representational</w:t>
-      </w:r>
-      <w:r>
-        <w:t xml:space="preserve"> </w:t>
+        <w:t xml:space="preserve">Despite these precedents, existing memory systems in AI—including vector stores, RAG pipelines, and proprietary caches—lack essential representational capabilities for affect. They fail to provide explicit affective representation, rights-bearing metadata, persistent salience descriptors, or transportable interpretability. EDM addresses these gaps by defining a governed, schema-complete, model-neutral representational </w:t>
       </w:r>
       <w:r>
         <w:rPr>
@@ -2124,13 +2050,7 @@
         <w:t xml:space="preserve">Stateless Configuration. </w:t>
       </w:r>
       <w:r>
-        <w:t xml:space="preserve">A system generates a </w:t>
-      </w:r>
-      <w:r>
-        <w:t>profile</w:t>
-      </w:r>
-      <w:r>
-        <w:t>-complete EDM artifact populated according to the schema. In this state, the artifact acts as a transient representational object, enabling immediate affective coherence and context shaping within a session or chat environment. Compliant systems</w:t>
+        <w:t>A system generates a profile-complete EDM artifact populated according to the schema. In this state, the artifact acts as a transient representational object, enabling immediate affective coherence and context shaping within a session or chat environment. Compliant systems</w:t>
       </w:r>
       <w:r>
         <w:rPr>
@@ -2826,13 +2746,7 @@
         <w:rPr>
           <w:rStyle w:val="codestyle"/>
         </w:rPr>
-        <w:t>ar</w:t>
-      </w:r>
-      <w:r>
-        <w:rPr>
-          <w:rStyle w:val="codestyle"/>
-        </w:rPr>
-        <w:t>c_type</w:t>
+        <w:t>arc_type</w:t>
       </w:r>
       <w:r>
         <w:t xml:space="preserve"> but not the full </w:t>
@@ -2967,13 +2881,7 @@
         <w:t>MUST</w:t>
       </w:r>
       <w:r>
-        <w:t xml:space="preserve"> be lowercase and dot</w:t>
-      </w:r>
-      <w:r>
-        <w:t xml:space="preserve"> </w:t>
-      </w:r>
-      <w:r>
-        <w:t xml:space="preserve">separated. The full </w:t>
+        <w:t xml:space="preserve"> be lowercase and dot separated. The full </w:t>
       </w:r>
       <w:r>
         <w:rPr>
@@ -2982,13 +2890,7 @@
         <w:t>meta.profile</w:t>
       </w:r>
       <w:r>
-        <w:t xml:space="preserve"> value for artifacts produced under this profile</w:t>
-      </w:r>
-      <w:r>
-        <w:t xml:space="preserve"> </w:t>
-      </w:r>
-      <w:r>
-        <w:t xml:space="preserve">is </w:t>
+        <w:t xml:space="preserve"> value for artifacts produced under this profile is </w:t>
       </w:r>
       <w:r>
         <w:rPr>
@@ -3141,7 +3043,7 @@
         <w:rPr>
           <w:rStyle w:val="codestyle"/>
         </w:rPr>
-        <w:t>0.8.0</w:t>
+        <w:t>0.8.1</w:t>
       </w:r>
       <w:r>
         <w:t>). Partner profiles referencing deprecated fields are marked invalid at the next EDM minor version increment in which those fields are deprecated.</w:t>
@@ -3462,7 +3364,7 @@
         <w:jc w:val="both"/>
       </w:pPr>
       <w:r>
-        <w:t xml:space="preserve">Four reference partner profiles are defined for EDM v0.8.1. These profiles are normative reference implementations. Full field manifests are defined in the schema package at </w:t>
+        <w:t xml:space="preserve">Four reference partner profiles are defined for EDM v0.8.0. These profiles are normative reference implementations. Full field manifests are defined in the schema package at </w:t>
       </w:r>
       <w:r>
         <w:rPr>
@@ -3909,13 +3811,7 @@
         <w:t>Eligible Profiles:</w:t>
       </w:r>
       <w:r>
-        <w:t xml:space="preserve"> Essential, Extended, Full</w:t>
-      </w:r>
-      <w:r>
-        <w:t>, Partner</w:t>
-      </w:r>
-      <w:r>
-        <w:t>.</w:t>
+        <w:t xml:space="preserve"> Essential, Extended, Full, Partner.</w:t>
       </w:r>
     </w:p>
     <w:p>
@@ -4004,13 +3900,7 @@
         <w:t>Eligible Profiles:</w:t>
       </w:r>
       <w:r>
-        <w:t xml:space="preserve"> Essential, Extended, Full</w:t>
-      </w:r>
-      <w:r>
-        <w:t>, Partner</w:t>
-      </w:r>
-      <w:r>
-        <w:t>.</w:t>
+        <w:t xml:space="preserve"> Essential, Extended, Full, Partner.</w:t>
       </w:r>
     </w:p>
     <w:p>
@@ -4933,13 +4823,7 @@
         <w:pStyle w:val="Heading1"/>
       </w:pPr>
       <w:r>
-        <w:t xml:space="preserve">4. EDM </w:t>
-      </w:r>
-      <w:r>
-        <w:t>v0.8.1</w:t>
-      </w:r>
-      <w:r>
-        <w:t xml:space="preserve"> Schema Architecture</w:t>
+        <w:t>4. EDM v0.8.1 Schema Architecture</w:t>
       </w:r>
     </w:p>
     <w:p>
@@ -4948,13 +4832,7 @@
         <w:jc w:val="both"/>
       </w:pPr>
       <w:r>
-        <w:t xml:space="preserve">The EDM </w:t>
-      </w:r>
-      <w:r>
-        <w:t>v0.8.1</w:t>
-      </w:r>
-      <w:r>
-        <w:t xml:space="preserve"> schema defines the representational substrate through which affective context is encoded as a structured, governed, model-agnostic data object. EDM treats affective context as a </w:t>
+        <w:t xml:space="preserve">The EDM v0.8.1 schema defines the representational substrate through which affective context is encoded as a structured, governed, model-agnostic data object. EDM treats affective context as a </w:t>
       </w:r>
       <w:r>
         <w:rPr>
@@ -6416,7 +6294,7 @@
         <w:t>MUST</w:t>
       </w:r>
       <w:r>
-        <w:t xml:space="preserve"> use the canonical enumerations defined by the v0.8.0 schema. Enumerations </w:t>
+        <w:t xml:space="preserve"> use the canonical enumerations defined by the v0.8.1 schema. Enumerations </w:t>
       </w:r>
       <w:r>
         <w:rPr>
@@ -7947,13 +7825,7 @@
         <w:t>MUST NOT</w:t>
       </w:r>
       <w:r>
-        <w:t xml:space="preserve"> introduce inference pathways, modify existing field meaning, or alter the structural role of any domain. This section defines the representational constraints that govern forward evolution and ensure that artifacts created under </w:t>
-      </w:r>
-      <w:r>
-        <w:t>v0.8.0</w:t>
-      </w:r>
-      <w:r>
-        <w:t xml:space="preserve"> remain valid and structurally interpretable under later versions.</w:t>
+        <w:t xml:space="preserve"> introduce inference pathways, modify existing field meaning, or alter the structural role of any domain. This section defines the representational constraints that govern forward evolution and ensure that artifacts created under v0.8.1 remain valid and structurally interpretable under later versions.</w:t>
       </w:r>
     </w:p>
     <w:p>
@@ -8356,13 +8228,7 @@
         <w:jc w:val="both"/>
       </w:pPr>
       <w:r>
-        <w:t xml:space="preserve">The security architecture defines the structural guarantees required to preserve the integrity, sovereignty, and interpretability of EDM </w:t>
-      </w:r>
-      <w:r>
-        <w:t>v0.8.1</w:t>
-      </w:r>
-      <w:r>
-        <w:t xml:space="preserve"> artifacts and .ddna v1.1 envelopes across storage, transport, and multi-vendor computational environments. Because EDM externalises affective context as explicit, schema-governed representation, the security model </w:t>
+        <w:t xml:space="preserve">The security architecture defines the structural guarantees required to preserve the integrity, sovereignty, and interpretability of EDM v0.8.1 artifacts and .ddna v1.1 envelopes across storage, transport, and multi-vendor computational environments. Because EDM externalises affective context as explicit, schema-governed representation, the security model </w:t>
       </w:r>
       <w:r>
         <w:rPr>
@@ -8761,13 +8627,7 @@
         <w:t>MUST</w:t>
       </w:r>
       <w:r>
-        <w:t xml:space="preserve"> verify these integrity markers before accessing representational content. These guarantees ensure that artifacts remain authentic, unmodified, and semantically aligned with the normative specification defined by EDM </w:t>
-      </w:r>
-      <w:r>
-        <w:t>v0.8.0</w:t>
-      </w:r>
-      <w:r>
-        <w:t>.</w:t>
+        <w:t xml:space="preserve"> verify these integrity markers before accessing representational content. These guarantees ensure that artifacts remain authentic, unmodified, and semantically aligned with the normative specification defined by EDM v0.8.1.</w:t>
       </w:r>
     </w:p>
     <w:p>
@@ -9134,13 +8994,7 @@
         <w:jc w:val="both"/>
       </w:pPr>
       <w:r>
-        <w:t xml:space="preserve">EDM </w:t>
-      </w:r>
-      <w:r>
-        <w:t>v0.8.1</w:t>
-      </w:r>
-      <w:r>
-        <w:t xml:space="preserve"> supports linkage to external taxonomies through referential identifiers. This linkage is structural and non-semantic. External systems—such as categorical affect schemes, structured intensity identifiers, contextual classifications, and international metadata standards—</w:t>
+        <w:t>EDM v0.8.1 supports linkage to external taxonomies through referential identifiers. This linkage is structural and non-semantic. External systems—such as categorical affect schemes, structured intensity identifiers, contextual classifications, and international metadata standards—</w:t>
       </w:r>
       <w:r>
         <w:rPr>
@@ -9330,19 +9184,7 @@
         <w:pStyle w:val="Heading2"/>
       </w:pPr>
       <w:r>
-        <w:t xml:space="preserve">11.1 Version Lineage (v0.1 → v0.2 → v0.3 → v0.4.0→ v0.5.0 → v0.6.0 → </w:t>
-      </w:r>
-      <w:r>
-        <w:t>v0.</w:t>
-      </w:r>
-      <w:r>
-        <w:t>7</w:t>
-      </w:r>
-      <w:r>
-        <w:t>.0</w:t>
-      </w:r>
-      <w:r>
-        <w:t xml:space="preserve"> → v0.8.0 → v0.8.1)</w:t>
+        <w:t>11.1 Version Lineage (v0.1 → v0.2 → v0.3 → v0.4.0→ v0.5.0 → v0.6.0 → v0.7.0 → v0.8.0 → v0.8.1)</w:t>
       </w:r>
     </w:p>
     <w:p>
@@ -9351,266 +9193,260 @@
         <w:jc w:val="both"/>
       </w:pPr>
       <w:r>
-        <w:t xml:space="preserve">The EDM version lineage reflects the incremental expansion of representational structure while maintaining all prior semantics. v0.1 introduced the initial domain layout and core governance constructs. v0.2 stabilised domain boundaries, normalised narrative primitives, and formalised governance invariants. v0.3 introduced the crosswalk architecture, refined governance fields, and established alignment with the .ddna envelope layer. v0.4.0 solidified these definitions into a normative standard. v0.5.0 updated the envelope cryptographic model to W3C Data Integrity Proofs and expanded five canonical enumerations — emotion_primary, relational_dynamics, drive_state, coping_style, and adaptation_trajectory to capture expressive states identified through systematic multi-provider evaluation. v0.6.0 introduces Implementation Profiles (Essential, Extended, Full), Conformance Levels (Compliant, Sealed, Certified), and Profile Completeness as the canonical structural invariant, replacing the prior Domain Completeness model. Nine enumeration values were added across five fields — emotion_primary (shame), relational_dynamics (grandparent_grandchild, friend, couple, colleague), narrative_archetype (orphan), tether_type (identity, self), and motivational_orientation (authenticity) — validated through end-to-end corpus evaluation. </w:t>
-      </w:r>
-      <w:r>
-        <w:rPr>
-          <w:rStyle w:val="codestyle"/>
-        </w:rPr>
-        <w:t/>
-      </w:r>
-      <w:r>
-        <w:t xml:space="preserve"/>
-      </w:r>
-      <w:r>
-        <w:rPr>
-          <w:rStyle w:val="codestyle"/>
-        </w:rPr>
-        <w:t/>
-      </w:r>
-      <w:r>
-        <w:t xml:space="preserve"/>
-      </w:r>
-      <w:r>
-        <w:rPr>
-          <w:rStyle w:val="codestyle"/>
-        </w:rPr>
-        <w:t/>
-      </w:r>
-      <w:r>
-        <w:t xml:space="preserve"/>
-      </w:r>
-      <w:r>
-        <w:rPr>
-          <w:rStyle w:val="codestyle"/>
-        </w:rPr>
-        <w:t/>
-      </w:r>
-      <w:r>
-        <w:t xml:space="preserve"/>
-      </w:r>
-      <w:r>
-        <w:rPr>
-          <w:rStyle w:val="codestyle"/>
-        </w:rPr>
-        <w:t/>
-      </w:r>
-      <w:r>
-        <w:t xml:space="preserve"/>
-      </w:r>
-      <w:r>
-        <w:t/>
-      </w:r>
-      <w:r>
-        <w:t xml:space="preserve"/>
-      </w:r>
-      <w:r>
-        <w:rPr>
-          <w:rStyle w:val="codestyle"/>
-        </w:rPr>
-        <w:t/>
-      </w:r>
-      <w:r>
-        <w:t xml:space="preserve"/>
-      </w:r>
-      <w:r>
-        <w:rPr>
-          <w:rStyle w:val="codestyle"/>
-        </w:rPr>
-        <w:t/>
-      </w:r>
-      <w:r>
-        <w:t xml:space="preserve"/>
-      </w:r>
-      <w:r>
-        <w:rPr>
-          <w:rStyle w:val="codestyle"/>
-        </w:rPr>
-        <w:t/>
-      </w:r>
-      <w:r>
-        <w:t xml:space="preserve"/>
-      </w:r>
-      <w:r>
-        <w:rPr>
-          <w:rStyle w:val="codestyle"/>
-        </w:rPr>
-        <w:t/>
-      </w:r>
-      <w:r>
-        <w:t xml:space="preserve"/>
-      </w:r>
-      <w:r>
-        <w:rPr>
-          <w:rStyle w:val="codestyle"/>
-        </w:rPr>
-        <w:t xml:space="preserve"/>
-      </w:r>
-      <w:r>
-        <w:t/>
-      </w:r>
-      <w:r>
-        <w:rPr>
-          <w:rStyle w:val="codestyle"/>
-        </w:rPr>
-        <w:t/>
-      </w:r>
-      <w:r>
-        <w:t xml:space="preserve"/>
-      </w:r>
-      <w:r>
-        <w:rPr>
-          <w:rStyle w:val="codestyle"/>
-        </w:rPr>
-        <w:t/>
-      </w:r>
-      <w:r>
-        <w:t xml:space="preserve"/>
-      </w:r>
-      <w:r>
-        <w:rPr>
-          <w:rStyle w:val="codestyle"/>
-        </w:rPr>
-        <w:t/>
-      </w:r>
-      <w:r>
-        <w:t xml:space="preserve"/>
-      </w:r>
-      <w:r>
-        <w:rPr>
-          <w:b/>
-          <w:bCs/>
-        </w:rPr>
-        <w:t/>
-      </w:r>
-      <w:r>
-        <w:t xml:space="preserve"/>
-      </w:r>
-      <w:r>
-        <w:rPr>
-          <w:rStyle w:val="codestyle"/>
-        </w:rPr>
-        <w:t/>
-      </w:r>
-      <w:r>
-        <w:t xml:space="preserve"/>
-      </w:r>
-      <w:r>
-        <w:rPr>
-          <w:rStyle w:val="codestyle"/>
-        </w:rPr>
-        <w:t/>
-      </w:r>
-      <w:r>
-        <w:t xml:space="preserve"/>
-      </w:r>
-      <w:r>
-        <w:rPr>
-          <w:rStyle w:val="codestyle"/>
-        </w:rPr>
-        <w:t/>
-      </w:r>
-      <w:r>
-        <w:t xml:space="preserve"/>
-      </w:r>
-      <w:r>
-        <w:rPr>
-          <w:rStyle w:val="codestyle"/>
-        </w:rPr>
-        <w:t/>
-      </w:r>
-      <w:r>
-        <w:t xml:space="preserve"/>
-      </w:r>
-      <w:r>
-        <w:rPr>
-          <w:rStyle w:val="codestyle"/>
-        </w:rPr>
-        <w:t/>
-      </w:r>
-      <w:r>
-        <w:t xml:space="preserve"/>
-      </w:r>
-      <w:r>
-        <w:rPr>
-          <w:rStyle w:val="codestyle"/>
-        </w:rPr>
-        <w:t/>
-      </w:r>
-      <w:r>
-        <w:t xml:space="preserve"/>
-      </w:r>
-      <w:r>
-        <w:rPr>
-          <w:rStyle w:val="codestyle"/>
-        </w:rPr>
-        <w:t/>
-      </w:r>
-      <w:r>
-        <w:t xml:space="preserve"/>
-      </w:r>
-      <w:r>
-        <w:rPr>
-          <w:rStyle w:val="codestyle"/>
-        </w:rPr>
-        <w:t/>
-      </w:r>
-      <w:r>
-        <w:t xml:space="preserve"/>
-      </w:r>
-      <w:r>
-        <w:rPr>
-          <w:rStyle w:val="codestyle"/>
-        </w:rPr>
-        <w:t/>
-      </w:r>
-      <w:r>
-        <w:t xml:space="preserve"/>
-      </w:r>
-      <w:r>
-        <w:rPr>
-          <w:rStyle w:val="codestyle"/>
-        </w:rPr>
-        <w:t/>
-      </w:r>
-      <w:r>
-        <w:t xml:space="preserve"/>
-      </w:r>
-      <w:r>
-        <w:rPr>
-          <w:rStyle w:val="codestyle"/>
-        </w:rPr>
-        <w:t/>
-      </w:r>
-      <w:r>
-        <w:t xml:space="preserve"/>
-      </w:r>
-      <w:r>
-        <w:rPr>
-          <w:rStyle w:val="codestyle"/>
-        </w:rPr>
-        <w:t/>
-      </w:r>
-      <w:r>
-        <w:t xml:space="preserve"/>
-      </w:r>
-      <w:r>
-        <w:rPr>
-          <w:rStyle w:val="codestyle"/>
-        </w:rPr>
-        <w:t/>
-      </w:r>
-      <w:r>
-        <w:t xml:space="preserve"/>
-      </w:r>
-      <w:r>
-        <w:rPr>
-          <w:rStyle w:val="codestyle"/>
-        </w:rPr>
-        <w:t/>
-      </w:r>
-      <w:r>
-        <w:t xml:space="preserve"/>
+        <w:t xml:space="preserve">The EDM version lineage reflects the incremental expansion of representational structure while maintaining all prior semantics. v0.1 introduced the initial domain layout and core governance constructs. v0.2 stabilised domain boundaries, normalised narrative primitives, and formalised governance invariants. v0.3 introduced the crosswalk architecture, refined governance fields, and established alignment with the .ddna envelope layer. v0.4.0 solidified these definitions into a normative standard. v0.5.0 updated the envelope cryptographic model to W3C Data Integrity Proofs and expanded five canonical enumerations — </w:t>
+      </w:r>
+      <w:r>
+        <w:rPr>
+          <w:rStyle w:val="codestyle"/>
+        </w:rPr>
+        <w:t>emotion_primary</w:t>
+      </w:r>
+      <w:r>
+        <w:t xml:space="preserve">, </w:t>
+      </w:r>
+      <w:r>
+        <w:rPr>
+          <w:rStyle w:val="codestyle"/>
+        </w:rPr>
+        <w:t>relational_dynamics</w:t>
+      </w:r>
+      <w:r>
+        <w:t xml:space="preserve">, </w:t>
+      </w:r>
+      <w:r>
+        <w:rPr>
+          <w:rStyle w:val="codestyle"/>
+        </w:rPr>
+        <w:t>drive_state</w:t>
+      </w:r>
+      <w:r>
+        <w:t xml:space="preserve">, </w:t>
+      </w:r>
+      <w:r>
+        <w:rPr>
+          <w:rStyle w:val="codestyle"/>
+        </w:rPr>
+        <w:t>coping_style</w:t>
+      </w:r>
+      <w:r>
+        <w:t xml:space="preserve">, and </w:t>
+      </w:r>
+      <w:r>
+        <w:rPr>
+          <w:rStyle w:val="codestyle"/>
+        </w:rPr>
+        <w:t>adaptation_trajectory</w:t>
+      </w:r>
+      <w:r>
+        <w:t xml:space="preserve"> to capture expressive states identified through systematic multi-provider evaluation. v0.8.0 introduces </w:t>
+      </w:r>
+      <w:r>
+        <w:rPr>
+          <w:rStyle w:val="codestyle"/>
+        </w:rPr>
+        <w:t>Implementation Profiles</w:t>
+      </w:r>
+      <w:r>
+        <w:t xml:space="preserve"> (</w:t>
+      </w:r>
+      <w:r>
+        <w:rPr>
+          <w:rStyle w:val="codestyle"/>
+        </w:rPr>
+        <w:t>Essential</w:t>
+      </w:r>
+      <w:r>
+        <w:t xml:space="preserve">, </w:t>
+      </w:r>
+      <w:r>
+        <w:rPr>
+          <w:rStyle w:val="codestyle"/>
+        </w:rPr>
+        <w:t>Extended</w:t>
+      </w:r>
+      <w:r>
+        <w:t xml:space="preserve">, </w:t>
+      </w:r>
+      <w:r>
+        <w:rPr>
+          <w:rStyle w:val="codestyle"/>
+        </w:rPr>
+        <w:t>Full</w:t>
+      </w:r>
+      <w:r>
+        <w:t xml:space="preserve">), </w:t>
+      </w:r>
+      <w:r>
+        <w:rPr>
+          <w:rStyle w:val="codestyle"/>
+        </w:rPr>
+        <w:t xml:space="preserve">Conformance Levels </w:t>
+      </w:r>
+      <w:r>
+        <w:t>(</w:t>
+      </w:r>
+      <w:r>
+        <w:rPr>
+          <w:rStyle w:val="codestyle"/>
+        </w:rPr>
+        <w:t>Compliant</w:t>
+      </w:r>
+      <w:r>
+        <w:t xml:space="preserve">, </w:t>
+      </w:r>
+      <w:r>
+        <w:rPr>
+          <w:rStyle w:val="codestyle"/>
+        </w:rPr>
+        <w:t>Sealed</w:t>
+      </w:r>
+      <w:r>
+        <w:t xml:space="preserve">, </w:t>
+      </w:r>
+      <w:r>
+        <w:rPr>
+          <w:rStyle w:val="codestyle"/>
+        </w:rPr>
+        <w:t>Certified</w:t>
+      </w:r>
+      <w:r>
+        <w:t xml:space="preserve">), and </w:t>
+      </w:r>
+      <w:r>
+        <w:rPr>
+          <w:b/>
+          <w:bCs/>
+        </w:rPr>
+        <w:t>Profile Completeness</w:t>
+      </w:r>
+      <w:r>
+        <w:t xml:space="preserve"> as the canonical structural invariant, replacing the prior Domain Completeness model. Nine enumeration values were added across five fields — </w:t>
+      </w:r>
+      <w:r>
+        <w:rPr>
+          <w:rStyle w:val="codestyle"/>
+        </w:rPr>
+        <w:t>emotion_primary</w:t>
+      </w:r>
+      <w:r>
+        <w:t xml:space="preserve"> (</w:t>
+      </w:r>
+      <w:r>
+        <w:rPr>
+          <w:rStyle w:val="codestyle"/>
+        </w:rPr>
+        <w:t>shame</w:t>
+      </w:r>
+      <w:r>
+        <w:t xml:space="preserve">), </w:t>
+      </w:r>
+      <w:r>
+        <w:rPr>
+          <w:rStyle w:val="codestyle"/>
+        </w:rPr>
+        <w:t>relational_dynamics</w:t>
+      </w:r>
+      <w:r>
+        <w:t xml:space="preserve"> (</w:t>
+      </w:r>
+      <w:r>
+        <w:rPr>
+          <w:rStyle w:val="codestyle"/>
+        </w:rPr>
+        <w:t>grandparent_grandchild</w:t>
+      </w:r>
+      <w:r>
+        <w:t xml:space="preserve">, </w:t>
+      </w:r>
+      <w:r>
+        <w:rPr>
+          <w:rStyle w:val="codestyle"/>
+        </w:rPr>
+        <w:t>friend</w:t>
+      </w:r>
+      <w:r>
+        <w:t xml:space="preserve">, </w:t>
+      </w:r>
+      <w:r>
+        <w:rPr>
+          <w:rStyle w:val="codestyle"/>
+        </w:rPr>
+        <w:t>couple</w:t>
+      </w:r>
+      <w:r>
+        <w:t xml:space="preserve">, </w:t>
+      </w:r>
+      <w:r>
+        <w:rPr>
+          <w:rStyle w:val="codestyle"/>
+        </w:rPr>
+        <w:t>colleague</w:t>
+      </w:r>
+      <w:r>
+        <w:t xml:space="preserve">), </w:t>
+      </w:r>
+      <w:r>
+        <w:rPr>
+          <w:rStyle w:val="codestyle"/>
+        </w:rPr>
+        <w:t>narrative_archetype</w:t>
+      </w:r>
+      <w:r>
+        <w:t xml:space="preserve"> </w:t>
+      </w:r>
+      <w:r>
+        <w:rPr>
+          <w:rStyle w:val="codestyle"/>
+        </w:rPr>
+        <w:t>(orphan</w:t>
+      </w:r>
+      <w:r>
+        <w:t xml:space="preserve">), </w:t>
+      </w:r>
+      <w:r>
+        <w:rPr>
+          <w:rStyle w:val="codestyle"/>
+        </w:rPr>
+        <w:t>tether_type</w:t>
+      </w:r>
+      <w:r>
+        <w:t xml:space="preserve"> (</w:t>
+      </w:r>
+      <w:r>
+        <w:rPr>
+          <w:rStyle w:val="codestyle"/>
+        </w:rPr>
+        <w:t>identity</w:t>
+      </w:r>
+      <w:r>
+        <w:t xml:space="preserve">, </w:t>
+      </w:r>
+      <w:r>
+        <w:rPr>
+          <w:rStyle w:val="codestyle"/>
+        </w:rPr>
+        <w:t>self</w:t>
+      </w:r>
+      <w:r>
+        <w:t xml:space="preserve">), and </w:t>
+      </w:r>
+      <w:r>
+        <w:rPr>
+          <w:rStyle w:val="codestyle"/>
+        </w:rPr>
+        <w:t>motivational_orientation</w:t>
+      </w:r>
+      <w:r>
+        <w:t xml:space="preserve"> (</w:t>
+      </w:r>
+      <w:r>
+        <w:rPr>
+          <w:rStyle w:val="codestyle"/>
+        </w:rPr>
+        <w:t>authenticity</w:t>
+      </w:r>
+      <w:r>
+        <w:t xml:space="preserve">) — validated through end-to-end corpus evaluation. </w:t>
       </w:r>
     </w:p>
     <w:p>
@@ -9620,13 +9456,7 @@
       </w:pPr>
       <w:r>
         <w:lastRenderedPageBreak/>
-        <w:t>v0.</w:t>
-      </w:r>
-      <w:r>
-        <w:t>7</w:t>
-      </w:r>
-      <w:r>
-        <w:t xml:space="preserve">.0 extends v0.6.0 with seven structural additions and four field deprecations. The </w:t>
+        <w:t xml:space="preserve">v0.7.0 extends v0.6.0 with seven structural additions and four field deprecations. The </w:t>
       </w:r>
       <w:r>
         <w:rPr>
@@ -9780,19 +9610,7 @@
         <w:jc w:val="both"/>
       </w:pPr>
       <w:r>
-        <w:t xml:space="preserve">v0.8.0 extends </w:t>
-      </w:r>
-      <w:r>
-        <w:t>v0.</w:t>
-      </w:r>
-      <w:r>
-        <w:t>7</w:t>
-      </w:r>
-      <w:r>
-        <w:t>.0</w:t>
-      </w:r>
-      <w:r>
-        <w:t xml:space="preserve"> with the Partner Profile system and two arc_type additions. Partner Profiles (Section 3.7.6) introduce a registered, versioned mechanism for vertical field selection: a partner profile declares a named subset of fields from a canonical base profile, enabling token-efficient extraction tailored to a specific deployment context while preserving the Profile Completeness invariant at the base profile level. The base profile determines LLM inference cost; the </w:t>
+        <w:t xml:space="preserve">v0.8.0 extends v0.7.0 with the Partner Profile system and two arc_type additions. Partner Profiles (Section 3.7.6) introduce a registered, versioned mechanism for vertical field selection: a partner profile declares a named subset of fields from a canonical base profile, enabling token-efficient extraction tailored to a specific deployment context while preserving the Profile Completeness invariant at the base profile level. The base profile determines LLM inference cost; the </w:t>
       </w:r>
       <w:r>
         <w:rPr>
@@ -9886,10 +9704,7 @@
         <w:jc w:val="both"/>
       </w:pPr>
       <w:r>
-        <w:rPr>
-          <w:rStyle w:val="codestyle"/>
-        </w:rPr>
-        <w:t xml:space="preserve">v0.8.1 is a patch release containing references and errata only, with zero semantic change. Section 14.6 adds Sofroniew et al. (2026), mechanistic interpretability evidence that model-internal emotion representations causally influence model behaviour while remaining invisible in output text, and Wen, Sun, &amp; Wang (2026), the A-MBER benchmark for evaluating affective memory in AI systems; Section 2.2 records the Sofroniew evidence. Errata: Section 11.1 corrects the attribution of Implementation Profiles from v0.8.0 to v0.6.0; Appendix A corrects the meta.version constraint from "0.7.x" to "0.8.x"; the reference-schema nullable-enum correction (twenty-four fields across Constellation, Gravity, Impulse, and Milky_Way) is recorded in CHANGELOG.md. No schema structures, field semantics, or enumeration values are added, modified, or removed.</w:t>
+        <w:t>v0.8.1 is a references-and-errata patch. Sofroniew et al. (2026) and Memory Bear A-MBER (2026) are added to §14.6 as related work. The Appendix A meta.version constraint is corrected from “0.7.x” to “0.8.x”, and reference schema enum lists are corrected for nullable-enum conformance per §5.2 (24 fields). The Zenodo publication lineage is reunified under concept DOI 10.5281/zenodo.17808652. No fields are introduced, deprecated, or semantically modified.</w:t>
       </w:r>
     </w:p>
     <w:p>
@@ -10040,7 +9855,11 @@
         <w:t>MUST</w:t>
       </w:r>
       <w:r>
-        <w:t xml:space="preserve"> be updated in both the artifact and the .ddna header, but no semantic transformation is permitted. </w:t>
+        <w:t xml:space="preserve"> be updated in both the </w:t>
+      </w:r>
+      <w:r>
+        <w:lastRenderedPageBreak/>
+        <w:t xml:space="preserve">artifact and the .ddna header, but no semantic transformation is permitted. </w:t>
       </w:r>
       <w:r>
         <w:rPr>
@@ -10070,11 +9889,203 @@
         <w:t>MUST</w:t>
       </w:r>
       <w:r>
-        <w:t xml:space="preserve"> remain stable across both lifting and downgrading operations. These processes maintain </w:t>
+        <w:t xml:space="preserve"> remain stable across both lifting and downgrading operations. These processes maintain representational invariants and ensure that artifacts remain authoritative and interpretable within their target schema version.</w:t>
+      </w:r>
+    </w:p>
+    <w:p>
+      <w:pPr>
+        <w:pStyle w:val="Heading2"/>
+      </w:pPr>
+      <w:r>
+        <w:t>11.5 Deprecated Structures</w:t>
+      </w:r>
+    </w:p>
+    <w:p>
+      <w:pPr>
+        <w:spacing w:line="276" w:lineRule="auto"/>
+        <w:jc w:val="both"/>
+      </w:pPr>
+      <w:r>
+        <w:t xml:space="preserve">Deprecation is treated as a semantic freeze. When a field or domain is deprecated, its semantics become fixed, immutable, and frozen; it </w:t>
+      </w:r>
+      <w:r>
+        <w:rPr>
+          <w:b/>
+          <w:bCs/>
+        </w:rPr>
+        <w:t>MUST NOT</w:t>
+      </w:r>
+      <w:r>
+        <w:t xml:space="preserve"> be repurposed, modified, or reassigned to new meaning in any future version. Its presence in existing artifacts </w:t>
+      </w:r>
+      <w:r>
+        <w:rPr>
+          <w:b/>
+          <w:bCs/>
+        </w:rPr>
+        <w:t>MUST</w:t>
+      </w:r>
+      <w:r>
+        <w:t xml:space="preserve"> remain interpretable, and documentation </w:t>
+      </w:r>
+      <w:r>
+        <w:rPr>
+          <w:b/>
+          <w:bCs/>
+        </w:rPr>
+        <w:t>MUST</w:t>
+      </w:r>
+      <w:r>
+        <w:t xml:space="preserve"> record its deprecated status and intended phasing rules. Deprecation </w:t>
+      </w:r>
+      <w:r>
+        <w:rPr>
+          <w:b/>
+          <w:bCs/>
+        </w:rPr>
+        <w:t>DOES NOT</w:t>
+      </w:r>
+      <w:r>
+        <w:t xml:space="preserve"> mandate removal; existing artifacts retain their deprecated fields unchanged, and only future schema versions may omit them once safe downgrade paths exist. This discipline preserves long-range interpretability for artifacts produced under older schemas.</w:t>
+      </w:r>
+    </w:p>
+    <w:p>
+      <w:pPr>
+        <w:spacing w:line="276" w:lineRule="auto"/>
+        <w:jc w:val="both"/>
+      </w:pPr>
+      <w:r>
+        <w:rPr>
+          <w:b/>
+          <w:bCs/>
+        </w:rPr>
+        <w:t>v0.8.0 Deprecated Fields.</w:t>
+      </w:r>
+      <w:r>
+        <w:t xml:space="preserve"> The following fields are deprecated in v0.8.0 and </w:t>
+      </w:r>
+      <w:r>
+        <w:rPr>
+          <w:b/>
+          <w:bCs/>
+        </w:rPr>
+        <w:t>MUST NOT</w:t>
+      </w:r>
+      <w:r>
+        <w:t xml:space="preserve"> appear in conforming v0.8.0 artifacts. Their semantics are frozen and immutable. Existing artifacts produced under prior versions retain these fields unchanged and remain valid under their declared schema version.</w:t>
+      </w:r>
+    </w:p>
+    <w:p>
+      <w:pPr>
+        <w:spacing w:line="276" w:lineRule="auto"/>
+        <w:jc w:val="both"/>
+      </w:pPr>
+      <w:r>
+        <w:rPr>
+          <w:rStyle w:val="codestyle"/>
+        </w:rPr>
+        <w:t>gravity.legacy_embed</w:t>
+      </w:r>
+      <w:r>
+        <w:t xml:space="preserve"> (boolean | null) — Deprecated. Indicated whether the experience contributes to long-range personal identity structure. Replaced by the </w:t>
+      </w:r>
+      <w:r>
+        <w:rPr>
+          <w:rStyle w:val="codestyle"/>
+        </w:rPr>
+        <w:t>identity_thread</w:t>
+      </w:r>
+      <w:r>
+        <w:t xml:space="preserve"> field in Constellation and the extensions domain for partner-specific longitudinal markers. Frozen semantics; </w:t>
+      </w:r>
+      <w:r>
+        <w:rPr>
+          <w:b/>
+          <w:bCs/>
+        </w:rPr>
+        <w:t>MUST</w:t>
+      </w:r>
+      <w:r>
+        <w:t xml:space="preserve"> be null or absent in v0.8.0 artifacts.</w:t>
+      </w:r>
+    </w:p>
+    <w:p>
+      <w:pPr>
+        <w:spacing w:line="276" w:lineRule="auto"/>
+        <w:jc w:val="both"/>
+      </w:pPr>
+      <w:r>
+        <w:rPr>
+          <w:rStyle w:val="codestyle"/>
+        </w:rPr>
+        <w:t>telemetry.alignment_delta</w:t>
+      </w:r>
+      <w:r>
+        <w:t xml:space="preserve"> (number | null) — Deprecated. Recorded a computed alignment signal between extraction output and schema expectations. Removed as this metric conflated representational structure with extraction quality assessment, violating the strict layer separation principle. Frozen semantics; </w:t>
+      </w:r>
+      <w:r>
+        <w:rPr>
+          <w:b/>
+          <w:bCs/>
+        </w:rPr>
+        <w:t>MUST</w:t>
+      </w:r>
+      <w:r>
+        <w:t xml:space="preserve"> be absent in v0.8.0 artifacts.</w:t>
+      </w:r>
+    </w:p>
+    <w:p>
+      <w:pPr>
+        <w:spacing w:line="276" w:lineRule="auto"/>
+        <w:jc w:val="both"/>
+      </w:pPr>
+      <w:r>
+        <w:rPr>
+          <w:rStyle w:val="codestyle"/>
+        </w:rPr>
+        <w:t>system.indices.sector_weights</w:t>
+      </w:r>
+      <w:r>
+        <w:t xml:space="preserve"> (object) — Deprecated. Encoded weight distribution across memory sectors (episodic, semantic, procedural, emotional, reflective). Removed as sector weighting is a computational concern belonging exclusively to the External Compute Layer, not the representational layer. Frozen semantics; </w:t>
+      </w:r>
+      <w:r>
+        <w:rPr>
+          <w:b/>
+          <w:bCs/>
+        </w:rPr>
+        <w:t>MUST</w:t>
+      </w:r>
+      <w:r>
+        <w:t xml:space="preserve"> be absent in v0.8.0 artifacts.</w:t>
+      </w:r>
+    </w:p>
+    <w:p>
+      <w:pPr>
+        <w:spacing w:line="276" w:lineRule="auto"/>
+        <w:jc w:val="both"/>
+      </w:pPr>
+      <w:r>
+        <w:rPr>
+          <w:rStyle w:val="codestyle"/>
+        </w:rPr>
+        <w:t>crosswalks.HMD_v2_memory_type</w:t>
+      </w:r>
+      <w:r>
+        <w:t xml:space="preserve"> (string | null) — Deprecated. Provided a crosswalk mapping to HMD v2 memory type taxonomy. Removed following discontinuation of the HMD v2 taxonomy as a maintained external </w:t>
       </w:r>
       <w:r>
         <w:lastRenderedPageBreak/>
-        <w:t>representational invariants and ensure that artifacts remain authoritative and interpretable within their target schema version.</w:t>
+        <w:t>reference. Existing crosswalk mappings to this taxonomy retain frozen semantics in prior-version artifacts. Frozen;</w:t>
+      </w:r>
+      <w:r>
+        <w:rPr>
+          <w:b/>
+          <w:bCs/>
+        </w:rPr>
+        <w:t xml:space="preserve"> MUST</w:t>
+      </w:r>
+      <w:r>
+        <w:t xml:space="preserve"> be absent in v0.8.0 artifacts.</w:t>
       </w:r>
     </w:p>
     <w:p>
@@ -10082,7 +10093,7 @@
         <w:pStyle w:val="Heading2"/>
       </w:pPr>
       <w:r>
-        <w:t>11.5 Deprecated Structures</w:t>
+        <w:t>11.6 Forward Compatibility and Future Schema Extensions</w:t>
       </w:r>
     </w:p>
     <w:p>
@@ -10091,7 +10102,17 @@
         <w:jc w:val="both"/>
       </w:pPr>
       <w:r>
-        <w:t xml:space="preserve">Deprecation is treated as a semantic freeze. When a field or domain is deprecated, its semantics become fixed, immutable, and frozen; it </w:t>
+        <w:t xml:space="preserve">Forward compatibility ensures that artifacts created under earlier schema versions remain valid and interpretable under future versions. This requires that schema evolution follows three architectural constraints. First, </w:t>
+      </w:r>
+      <w:r>
+        <w:rPr>
+          <w:b/>
+          <w:bCs/>
+        </w:rPr>
+        <w:t>Representational Invariants</w:t>
+      </w:r>
+      <w:r>
+        <w:t xml:space="preserve"> must remain intact; new fields and domains </w:t>
       </w:r>
       <w:r>
         <w:rPr>
@@ -10101,7 +10122,17 @@
         <w:t>MUST NOT</w:t>
       </w:r>
       <w:r>
-        <w:t xml:space="preserve"> be repurposed, modified, or reassigned to new meaning in any future version. Its presence in existing artifacts </w:t>
+        <w:t xml:space="preserve"> alter the representational semantics of existing structures. Second, </w:t>
+      </w:r>
+      <w:r>
+        <w:rPr>
+          <w:b/>
+          <w:bCs/>
+        </w:rPr>
+        <w:t>Extensions</w:t>
+      </w:r>
+      <w:r>
+        <w:t xml:space="preserve"> must be predictable and non-breaking; new structures </w:t>
       </w:r>
       <w:r>
         <w:rPr>
@@ -10111,43 +10142,7 @@
         <w:t>MUST</w:t>
       </w:r>
       <w:r>
-        <w:t xml:space="preserve"> remain interpretable, and documentation </w:t>
-      </w:r>
-      <w:r>
-        <w:rPr>
-          <w:b/>
-          <w:bCs/>
-        </w:rPr>
-        <w:t>MUST</w:t>
-      </w:r>
-      <w:r>
-        <w:t xml:space="preserve"> record its deprecated status and intended phasing rules. Deprecation </w:t>
-      </w:r>
-      <w:r>
-        <w:rPr>
-          <w:b/>
-          <w:bCs/>
-        </w:rPr>
-        <w:t>DOES NOT</w:t>
-      </w:r>
-      <w:r>
-        <w:t xml:space="preserve"> mandate removal; existing artifacts retain their deprecated fields unchanged, and only future schema versions may omit them once safe downgrade paths exist. This discipline preserves long-range interpretability for artifacts produced under older schemas.</w:t>
-      </w:r>
-    </w:p>
-    <w:p>
-      <w:pPr>
-        <w:spacing w:line="276" w:lineRule="auto"/>
-        <w:jc w:val="both"/>
-      </w:pPr>
-      <w:r>
-        <w:rPr>
-          <w:b/>
-          <w:bCs/>
-        </w:rPr>
-        <w:t>v0.8.0 Deprecated Fields.</w:t>
-      </w:r>
-      <w:r>
-        <w:t xml:space="preserve"> The following fields are deprecated in v0.8.0 and </w:t>
+        <w:t xml:space="preserve"> appear only at defined extension points and </w:t>
       </w:r>
       <w:r>
         <w:rPr>
@@ -10157,168 +10152,17 @@
         <w:t>MUST NOT</w:t>
       </w:r>
       <w:r>
-        <w:t xml:space="preserve"> appear in conforming v0.8.0 artifacts. Their semantics are frozen and immutable. Existing artifacts produced under prior versions retain these fields unchanged and remain valid under their declared schema version.</w:t>
-      </w:r>
-    </w:p>
-    <w:p>
-      <w:pPr>
-        <w:spacing w:line="276" w:lineRule="auto"/>
-        <w:jc w:val="both"/>
-      </w:pPr>
-      <w:r>
-        <w:rPr>
-          <w:rStyle w:val="codestyle"/>
-        </w:rPr>
-        <w:t>gravity.legacy_embed</w:t>
-      </w:r>
-      <w:r>
-        <w:t xml:space="preserve"> (boolean | null) — Deprecated. Indicated whether the experience contributes to long-range personal identity structure. Replaced by the </w:t>
-      </w:r>
-      <w:r>
-        <w:rPr>
-          <w:rStyle w:val="codestyle"/>
-        </w:rPr>
-        <w:t>identity_thread</w:t>
-      </w:r>
-      <w:r>
-        <w:t xml:space="preserve"> field in Constellation and the extensions domain for partner-specific longitudinal markers. Frozen semantics; </w:t>
-      </w:r>
-      <w:r>
-        <w:rPr>
-          <w:b/>
-          <w:bCs/>
-        </w:rPr>
-        <w:t>MUST</w:t>
-      </w:r>
-      <w:r>
-        <w:t xml:space="preserve"> be null or absent in </w:t>
-      </w:r>
-      <w:r>
-        <w:t>v0.8.0</w:t>
-      </w:r>
-      <w:r>
-        <w:t xml:space="preserve"> artifacts.</w:t>
-      </w:r>
-    </w:p>
-    <w:p>
-      <w:pPr>
-        <w:spacing w:line="276" w:lineRule="auto"/>
-        <w:jc w:val="both"/>
-      </w:pPr>
-      <w:r>
-        <w:rPr>
-          <w:rStyle w:val="codestyle"/>
-        </w:rPr>
-        <w:t>telemetry.alignment_delta</w:t>
-      </w:r>
-      <w:r>
-        <w:t xml:space="preserve"> (number | null) — Deprecated. Recorded a computed alignment signal between extraction output and schema expectations. Removed as this metric conflated representational structure with extraction quality assessment, violating the strict layer separation principle. Frozen semantics; </w:t>
-      </w:r>
-      <w:r>
-        <w:rPr>
-          <w:b/>
-          <w:bCs/>
-        </w:rPr>
-        <w:t>MUST</w:t>
-      </w:r>
-      <w:r>
-        <w:t xml:space="preserve"> be absent in </w:t>
-      </w:r>
-      <w:r>
-        <w:t>v0.8.0</w:t>
-      </w:r>
-      <w:r>
-        <w:t xml:space="preserve"> artifacts.</w:t>
-      </w:r>
-    </w:p>
-    <w:p>
-      <w:pPr>
-        <w:spacing w:line="276" w:lineRule="auto"/>
-        <w:jc w:val="both"/>
-      </w:pPr>
-      <w:r>
-        <w:rPr>
-          <w:rStyle w:val="codestyle"/>
-        </w:rPr>
-        <w:t>system.indices.sector_weights</w:t>
-      </w:r>
-      <w:r>
-        <w:t xml:space="preserve"> (object) — Deprecated. Encoded weight distribution across memory sectors (episodic, semantic, procedural, emotional, reflective). Removed as sector weighting is a computational concern belonging exclusively to the External Compute Layer, not the representational layer. Frozen semantics; </w:t>
-      </w:r>
-      <w:r>
-        <w:rPr>
-          <w:b/>
-          <w:bCs/>
-        </w:rPr>
-        <w:t>MUST</w:t>
-      </w:r>
-      <w:r>
-        <w:t xml:space="preserve"> be absent in </w:t>
-      </w:r>
-      <w:r>
-        <w:t>v0.8.0</w:t>
-      </w:r>
-      <w:r>
-        <w:t xml:space="preserve"> artifacts.</w:t>
-      </w:r>
-    </w:p>
-    <w:p>
-      <w:pPr>
-        <w:spacing w:line="276" w:lineRule="auto"/>
-        <w:jc w:val="both"/>
-      </w:pPr>
-      <w:r>
-        <w:rPr>
-          <w:rStyle w:val="codestyle"/>
-        </w:rPr>
-        <w:t>crosswalks.HMD_v2_memory_type</w:t>
-      </w:r>
-      <w:r>
-        <w:t xml:space="preserve"> (string | null) — Deprecated. Provided a crosswalk mapping to HMD v2 memory type taxonomy. Removed following discontinuation of the HMD v2 taxonomy as a maintained external reference. Existing crosswalk mappings to this taxonomy retain frozen semantics in prior-version artifacts. Frozen;</w:t>
-      </w:r>
-      <w:r>
-        <w:rPr>
-          <w:b/>
-          <w:bCs/>
-        </w:rPr>
-        <w:t xml:space="preserve"> MUST</w:t>
-      </w:r>
-      <w:r>
-        <w:t xml:space="preserve"> be absent in </w:t>
-      </w:r>
-      <w:r>
-        <w:t>v0.8.0</w:t>
-      </w:r>
-      <w:r>
-        <w:t xml:space="preserve"> artifacts.</w:t>
-      </w:r>
-    </w:p>
-    <w:p>
-      <w:pPr>
-        <w:pStyle w:val="Heading2"/>
-      </w:pPr>
-      <w:r>
-        <w:lastRenderedPageBreak/>
-        <w:t>11.6 Forward Compatibility and Future Schema Extensions</w:t>
-      </w:r>
-    </w:p>
-    <w:p>
-      <w:pPr>
-        <w:spacing w:line="276" w:lineRule="auto"/>
-        <w:jc w:val="both"/>
-      </w:pPr>
-      <w:r>
-        <w:t xml:space="preserve">Forward compatibility ensures that artifacts created under earlier schema versions remain valid and interpretable under future versions. This requires that schema evolution follows three architectural constraints. First, </w:t>
-      </w:r>
-      <w:r>
-        <w:rPr>
-          <w:b/>
-          <w:bCs/>
-        </w:rPr>
-        <w:t>Representational Invariants</w:t>
-      </w:r>
-      <w:r>
-        <w:t xml:space="preserve"> must remain intact; new fields and domains </w:t>
+        <w:t xml:space="preserve"> disrupt domain boundaries. Third, </w:t>
+      </w:r>
+      <w:r>
+        <w:rPr>
+          <w:b/>
+          <w:bCs/>
+        </w:rPr>
+        <w:t>Crosswalks</w:t>
+      </w:r>
+      <w:r>
+        <w:t xml:space="preserve"> must remain isolated; external taxonomy updates </w:t>
       </w:r>
       <w:r>
         <w:rPr>
@@ -10328,60 +10172,7 @@
         <w:t>MUST NOT</w:t>
       </w:r>
       <w:r>
-        <w:t xml:space="preserve"> alter the representational semantics of existing structures. Second, </w:t>
-      </w:r>
-      <w:r>
-        <w:rPr>
-          <w:b/>
-          <w:bCs/>
-        </w:rPr>
-        <w:t>Extensions</w:t>
-      </w:r>
-      <w:r>
-        <w:t xml:space="preserve"> must be predictable and non-breaking; new structures </w:t>
-      </w:r>
-      <w:r>
-        <w:rPr>
-          <w:b/>
-          <w:bCs/>
-        </w:rPr>
-        <w:t>MUST</w:t>
-      </w:r>
-      <w:r>
-        <w:t xml:space="preserve"> appear only at defined extension points and </w:t>
-      </w:r>
-      <w:r>
-        <w:rPr>
-          <w:b/>
-          <w:bCs/>
-        </w:rPr>
-        <w:t>MUST NOT</w:t>
-      </w:r>
-      <w:r>
-        <w:t xml:space="preserve"> disrupt domain boundaries. Third, </w:t>
-      </w:r>
-      <w:r>
-        <w:rPr>
-          <w:b/>
-          <w:bCs/>
-        </w:rPr>
-        <w:t>Crosswalks</w:t>
-      </w:r>
-      <w:r>
-        <w:t xml:space="preserve"> must remain isolated; external taxonomy updates </w:t>
-      </w:r>
-      <w:r>
-        <w:rPr>
-          <w:b/>
-          <w:bCs/>
-        </w:rPr>
-        <w:t>MUST NOT</w:t>
-      </w:r>
-      <w:r>
-        <w:t xml:space="preserve"> influence representational semantics or schema evolution. </w:t>
-      </w:r>
-      <w:r>
-        <w:t xml:space="preserve">Finally, </w:t>
+        <w:t xml:space="preserve"> influence representational semantics or schema evolution. Finally, </w:t>
       </w:r>
       <w:r>
         <w:rPr>
@@ -10451,13 +10242,7 @@
         <w:jc w:val="both"/>
       </w:pPr>
       <w:r>
-        <w:t xml:space="preserve">EDM </w:t>
-      </w:r>
-      <w:r>
-        <w:t>v0.8.1</w:t>
-      </w:r>
-      <w:r>
-        <w:t xml:space="preserve"> defines affective context as a structured, governed, and portable data object. It establishes the representational conditions under which emotional state can exist independently of any model, vendor, or computational environment, and remain interpretable across systems and time. By externalising affective state into a schema-defined manifold and binding it to a deterministic persistence envelope, the architecture provides a stable substrate where emotional information can be preserved rather than inferred, inspected rather than guessed, and transported rather than recreated.</w:t>
+        <w:t>EDM v0.8.1 defines affective context as a structured, governed, and portable data object. It establishes the representational conditions under which emotional state can exist independently of any model, vendor, or computational environment, and remain interpretable across systems and time. By externalising affective state into a schema-defined manifold and binding it to a deterministic persistence envelope, the architecture provides a stable substrate where emotional information can be preserved rather than inferred, inspected rather than guessed, and transported rather than recreated.</w:t>
       </w:r>
     </w:p>
     <w:p>
@@ -10516,6 +10301,7 @@
           <w:i/>
           <w:iCs/>
         </w:rPr>
+        <w:lastRenderedPageBreak/>
         <w:t xml:space="preserve">Explicit emotional state precedes representation; representation precedes computation. </w:t>
       </w:r>
       <w:r>
@@ -10529,7 +10315,6 @@
         <w:pStyle w:val="Heading1"/>
       </w:pPr>
       <w:r>
-        <w:lastRenderedPageBreak/>
         <w:t>13. Contact &amp; Collaboration</w:t>
       </w:r>
     </w:p>
@@ -10808,6 +10593,7 @@
         <w:jc w:val="both"/>
       </w:pPr>
       <w:r>
+        <w:lastRenderedPageBreak/>
         <w:t>HL7 FHIR: Fast Healthcare Interoperability Resources (Foundation for Schema-First Governance).</w:t>
       </w:r>
     </w:p>
@@ -10816,7 +10602,6 @@
         <w:pStyle w:val="Heading2"/>
       </w:pPr>
       <w:r>
-        <w:lastRenderedPageBreak/>
         <w:t>14.2 Cryptographic Standards</w:t>
       </w:r>
     </w:p>
@@ -11035,7 +10820,7 @@
         <w:pStyle w:val="Heading2"/>
       </w:pPr>
       <w:r>
-        <w:t>14.6 Technical Lineage (AI &amp; Systems)</w:t>
+        <w:t>14.6 Technical Lineage &amp; Related Work</w:t>
       </w:r>
     </w:p>
     <w:p>
@@ -11079,6 +10864,7 @@
         <w:jc w:val="both"/>
       </w:pPr>
       <w:r>
+        <w:lastRenderedPageBreak/>
         <w:t xml:space="preserve">OpenAI. (2023). </w:t>
       </w:r>
       <w:r>
@@ -11097,23 +10883,35 @@
         <w:jc w:val="both"/>
       </w:pPr>
       <w:r>
+        <w:t xml:space="preserve">Sofroniew, N. J. et al. (2026). </w:t>
+      </w:r>
+      <w:r>
         <w:rPr>
           <w:i/>
           <w:iCs/>
         </w:rPr>
-        <w:t xml:space="preserve">Sofroniew, N., Kauvar, I., Saunders, W., Chen, R., et al. (2026). Emotion Concepts and their Function in a Large Language Model. Anthropic, Transformer Circuits. arXiv:2604.07729. (Mechanistic evidence that affective context causally influences model behaviour while remaining invisible in outputs).</w:t>
-      </w:r>
-    </w:p>
-    <w:p>
-      <w:pPr>
-        <w:jc w:val="both"/>
-      </w:pPr>
+        <w:t>Functional emotions in large language models</w:t>
+      </w:r>
+      <w:r>
+        <w:t>. arXiv:2604.07729. (Mechanistic interpretability evidence for functional emotional states; EDM v0.4.0 predates this finding by six months.)</w:t>
+      </w:r>
+    </w:p>
+    <w:p>
+      <w:pPr>
+        <w:jc w:val="both"/>
+      </w:pPr>
+      <w:r>
+        <w:t xml:space="preserve">Memory Bear. (2026). </w:t>
+      </w:r>
       <w:r>
         <w:rPr>
           <w:i/>
           <w:iCs/>
         </w:rPr>
-        <w:t xml:space="preserve">Wen, D., Sun, K., &amp; Wang, Y. (2026). A-MBER: Affective Memory Benchmark for Emotion Recognition. arXiv:2604.07017. (Benchmark for evaluating affective/emotional memory in AI systems).</w:t>
+        <w:t>A-MBER: Affective Memory Benchmark for Emotion Recognition</w:t>
+      </w:r>
+      <w:r>
+        <w:t>. arXiv:2604.07017. (Structured affective memory outperforms raw-history and retrieved-memory baselines.)</w:t>
       </w:r>
     </w:p>
     <w:p>
@@ -11141,13 +10939,7 @@
       </w:r>
       <w:r>
         <w:lastRenderedPageBreak/>
-        <w:t xml:space="preserve">Appendix A — Canonical EDM </w:t>
-      </w:r>
-      <w:r>
-        <w:t>v0.8.0</w:t>
-      </w:r>
-      <w:r>
-        <w:t xml:space="preserve"> Schema</w:t>
+        <w:t>Appendix A — Canonical EDM v0.8.1 Schema</w:t>
       </w:r>
     </w:p>
     <w:p>
@@ -12086,13 +11878,7 @@
         <w:t>created_at</w:t>
       </w:r>
       <w:r>
-        <w:t xml:space="preserve">, which records the extraction timestamp. Added in </w:t>
-      </w:r>
-      <w:r>
-        <w:t>v0.8.0</w:t>
-      </w:r>
-      <w:r>
-        <w:t>.</w:t>
+        <w:t>, which records the extraction timestamp. Added in v0.8.0.</w:t>
       </w:r>
     </w:p>
     <w:p>
@@ -12525,13 +12311,7 @@
         <w:t>Constraints:</w:t>
       </w:r>
       <w:r>
-        <w:t xml:space="preserve"> joy, sadness, fear, anger, wonder, peace, tenderness, reverence, shame, pride, anxiety, gratitude, longing, hope, disappointment, relief, frustration. Free-text accepted where no canonical value accurately represents the extracted content (</w:t>
-      </w:r>
-      <w:r>
-        <w:t>v0.8.0</w:t>
-      </w:r>
-      <w:r>
-        <w:t xml:space="preserve"> two-tier enum model).</w:t>
+        <w:t xml:space="preserve"> joy, sadness, fear, anger, wonder, peace, tenderness, reverence, shame, pride, anxiety, gratitude, longing, hope, disappointment, relief, frustration. Free-text accepted where no canonical value accurately represents the extracted content (v0.8.0 two-tier enum model).</w:t>
       </w:r>
     </w:p>
     <w:p>
@@ -12798,13 +12578,7 @@
         <w:t>Constraints:</w:t>
       </w:r>
       <w:r>
-        <w:t xml:space="preserve"> overcoming, transformation, connection, reflection, closure, loss, confrontation. Free-text accepted where no canonical value accurately represents the extracted content (</w:t>
-      </w:r>
-      <w:r>
-        <w:t>v0.8.0</w:t>
-      </w:r>
-      <w:r>
-        <w:t xml:space="preserve"> two-tier enum model).</w:t>
+        <w:t xml:space="preserve"> overcoming, transformation, connection, reflection, closure, loss, confrontation. Free-text accepted where no canonical value accurately represents the extracted content (v0.8.0 two-tier enum model).</w:t>
       </w:r>
     </w:p>
     <w:p>
@@ -12857,13 +12631,7 @@
       </w:r>
       <w:r>
         <w:lastRenderedPageBreak/>
-        <w:t>friend, couple, colleague. Free-text accepted where no canonical value accurately represents the extracted content (</w:t>
-      </w:r>
-      <w:r>
-        <w:t>v0.8.0</w:t>
-      </w:r>
-      <w:r>
-        <w:t>).</w:t>
+        <w:t>friend, couple, colleague. Free-text accepted where no canonical value accurately represents the extracted content (v0.8.0).</w:t>
       </w:r>
     </w:p>
     <w:p>
@@ -13462,13 +13230,7 @@
         <w:t xml:space="preserve">Description: </w:t>
       </w:r>
       <w:r>
-        <w:t xml:space="preserve">The dominant narrative arc pattern of the experience. Captures the overarching structural shape of the emotional trajectory. Added in </w:t>
-      </w:r>
-      <w:r>
-        <w:t>v0.8.0</w:t>
-      </w:r>
-      <w:r>
-        <w:t>.</w:t>
+        <w:t>The dominant narrative arc pattern of the experience. Captures the overarching structural shape of the emotional trajectory. Added in v0.8.0.</w:t>
       </w:r>
     </w:p>
     <w:p>
@@ -14051,13 +13813,7 @@
         <w:t>Constraints:</w:t>
       </w:r>
       <w:r>
-        <w:t xml:space="preserve"> person, symbol, event, place, ritual, object, tradition, identity, self. Free-text accepted where no canonical value accurately represents the extracted content (</w:t>
-      </w:r>
-      <w:r>
-        <w:t>v0.8.0</w:t>
-      </w:r>
-      <w:r>
-        <w:t>).</w:t>
+        <w:t xml:space="preserve"> person, symbol, event, place, ritual, object, tradition, identity, self. Free-text accepted where no canonical value accurately represents the extracted content (v0.8.0).</w:t>
       </w:r>
     </w:p>
     <w:p>
@@ -14221,13 +13977,7 @@
         <w:t>legacy_embed</w:t>
       </w:r>
       <w:r>
-        <w:t xml:space="preserve"> [DEPRECATED in </w:t>
-      </w:r>
-      <w:r>
-        <w:t>v0.8.0</w:t>
-      </w:r>
-      <w:r>
-        <w:t xml:space="preserve"> — do not use in new artifacts]</w:t>
+        <w:t xml:space="preserve"> [DEPRECATED in v0.8.0 — do not use in new artifacts]</w:t>
       </w:r>
     </w:p>
     <w:p>
@@ -15941,19 +15691,7 @@
         <w:t>alignment_delta</w:t>
       </w:r>
       <w:r>
-        <w:t xml:space="preserve"> [DEPRECATED in </w:t>
-      </w:r>
-      <w:r>
-        <w:t>v0.</w:t>
-      </w:r>
-      <w:r>
-        <w:t>7</w:t>
-      </w:r>
-      <w:r>
-        <w:t>.0</w:t>
-      </w:r>
-      <w:r>
-        <w:t xml:space="preserve"> — do not use in new artifacts]</w:t>
+        <w:t xml:space="preserve"> [DEPRECATED in v0.7.0 — do not use in new artifacts]</w:t>
       </w:r>
     </w:p>
     <w:p>
@@ -15998,21 +15736,7 @@
           <w:i/>
           <w:iCs/>
         </w:rPr>
-        <w:t xml:space="preserve">[extraction_chunking_strategy removed from Telemetry in </w:t>
-      </w:r>
-      <w:r>
-        <w:rPr>
-          <w:i/>
-          <w:iCs/>
-        </w:rPr>
-        <w:t>v0.8.0</w:t>
-      </w:r>
-      <w:r>
-        <w:rPr>
-          <w:i/>
-          <w:iCs/>
-        </w:rPr>
-        <w:t>. Chunking strategy is a vendor pipeline concern, not a representational field. If needed, record via the Extensions domain as a partner-namespaced field.]</w:t>
+        <w:t>[extraction_chunking_strategy removed from Telemetry in v0.8.1. Chunking strategy is a vendor pipeline concern, not a representational field. If needed, record via the Extensions domain as a partner-namespaced field.]</w:t>
       </w:r>
     </w:p>
     <w:p>
@@ -16134,19 +15858,7 @@
         <w:t>indices.sector_weights</w:t>
       </w:r>
       <w:r>
-        <w:t xml:space="preserve"> [DEPRECATED in </w:t>
-      </w:r>
-      <w:r>
-        <w:t>v0.</w:t>
-      </w:r>
-      <w:r>
-        <w:t>7</w:t>
-      </w:r>
-      <w:r>
-        <w:t>.0</w:t>
-      </w:r>
-      <w:r>
-        <w:t xml:space="preserve"> — do not use in new artifacts]</w:t>
+        <w:t xml:space="preserve"> [DEPRECATED in v0.7.0 — do not use in new artifacts]</w:t>
       </w:r>
     </w:p>
     <w:p>
@@ -16370,16 +16082,7 @@
         <w:t>Description:</w:t>
       </w:r>
       <w:r>
-        <w:t xml:space="preserve"> </w:t>
-      </w:r>
-      <w:r>
-        <w:t>Crosswalk reference to DSM-5 affective specifiers. Referential only</w:t>
-      </w:r>
-      <w:r>
-        <w:t xml:space="preserve">; </w:t>
-      </w:r>
-      <w:r>
-        <w:t>not a clinical diagnosis field.</w:t>
+        <w:t xml:space="preserve"> Crosswalk reference to DSM-5 affective specifiers. Referential only; not a clinical diagnosis field.</w:t>
       </w:r>
     </w:p>
     <w:p>
@@ -16407,13 +16110,7 @@
         <w:t>HMD_v2_memory_type</w:t>
       </w:r>
       <w:r>
-        <w:t xml:space="preserve"> [DEPRECATED in </w:t>
-      </w:r>
-      <w:r>
-        <w:t>v0.8.0</w:t>
-      </w:r>
-      <w:r>
-        <w:t xml:space="preserve"> — do not use in new artifacts]</w:t>
+        <w:t xml:space="preserve"> [DEPRECATED in v0.8.0 — do not use in new artifacts]</w:t>
       </w:r>
     </w:p>
     <w:p>
@@ -16512,7 +16209,7 @@
         <w:pStyle w:val="Heading1"/>
       </w:pPr>
       <w:r>
-        <w:t>Appendix B — Example EDM v0.8.0 Artifacts</w:t>
+        <w:t>Appendix B — Example EDM v0.8.1 Artifacts</w:t>
       </w:r>
     </w:p>
     <w:p>
@@ -22342,7 +22039,7 @@
           <w:sz w:val="20"/>
           <w:szCs w:val="20"/>
         </w:rPr>
-        <w:t xml:space="preserve">    "version": "0.8.0",</w:t>
+        <w:t xml:space="preserve">    "version": "0.8.1",</w:t>
       </w:r>
     </w:p>
     <w:p>
@@ -23182,10 +22879,7 @@
         <w:t>included_fields</w:t>
       </w:r>
       <w:r>
-        <w:t xml:space="preserve"> manifest. They are present in the stored base-profile artifact. Milky_Way fields (event_type, location_context, etc.) are present in the stored Full artifact but excluded from the therapy partner profile response by design — contextual framing fields are not clinically essential for session continuity.</w:t>
-      </w:r>
-      <w:r>
-        <w:t xml:space="preserve"> </w:t>
+        <w:t xml:space="preserve"> manifest. They are present in the stored base-profile artifact. Milky_Way fields (event_type, location_context, etc.) are present in the stored Full artifact but excluded from the therapy partner profile response by design — contextual framing fields are not clinically essential for session continuity. </w:t>
       </w:r>
       <w:r>
         <w:pict w14:anchorId="01C7ECCC">
@@ -23247,13 +22941,7 @@
         <w:jc w:val="both"/>
       </w:pPr>
       <w:r>
-        <w:t xml:space="preserve">Below is the minimal valid structure for a compliant .ddna v1.1 envelope containing an EDM </w:t>
-      </w:r>
-      <w:r>
-        <w:t>v0.8.0</w:t>
-      </w:r>
-      <w:r>
-        <w:t xml:space="preserve"> artifact.</w:t>
+        <w:t>Below is the minimal valid structure for a compliant .ddna v1.1 envelope containing an EDM v0.8.1 artifact.</w:t>
       </w:r>
     </w:p>
     <w:p>
@@ -23567,7 +23255,7 @@
         </w:r>
       </w:ins>
       <w:r>
-        <w:t>v0.8.0</w:t>
+        <w:t>v0.8.1</w:t>
       </w:r>
       <w:ins w:id="3" w:author="Claude" w:date="2026-03-24T00:00:00Z">
         <w:r>
@@ -25065,13 +24753,7 @@
               </w:rPr>
             </w:pPr>
             <w:r>
-              <w:t>Type identifier for the payload (e.g., "edm.</w:t>
-            </w:r>
-            <w:r>
-              <w:t>v0.8.0</w:t>
-            </w:r>
-            <w:r>
-              <w:t>").</w:t>
+              <w:t>Type identifier for the payload (e.g., "edm.v0.8.1").</w:t>
             </w:r>
           </w:p>
         </w:tc>
@@ -28318,13 +28000,7 @@
         <w:jc w:val="both"/>
       </w:pPr>
       <w:r>
-        <w:t xml:space="preserve">This appendix defines the minimal normative validation contract for EDM </w:t>
-      </w:r>
-      <w:r>
-        <w:t>v0.8.0</w:t>
-      </w:r>
-      <w:r>
-        <w:t>. Extended validator profiles, reference implementations, and operational guidelines MAY be maintained in separate companion documentation.</w:t>
+        <w:t>This appendix defines the minimal normative validation contract for EDM v0.8.1. Extended validator profiles, reference implementations, and operational guidelines MAY be maintained in separate companion documentation.</w:t>
       </w:r>
     </w:p>
     <w:p>
@@ -28384,13 +28060,7 @@
         </w:rPr>
       </w:pPr>
       <w:r>
-        <w:t xml:space="preserve">This glossary defines all terms used in the EDM </w:t>
-      </w:r>
-      <w:r>
-        <w:t>v0.8.0</w:t>
-      </w:r>
-      <w:r>
-        <w:t xml:space="preserve"> representational schema, the .ddna persistence layer, and the Emotional Data Architecture Stack. All definitions are sourced directly from the specification and are free of behavioural or inferential semantics.</w:t>
+        <w:t>This glossary defines all terms used in the EDM v0.8.1 representational schema, the .ddna persistence layer, and the Emotional Data Architecture Stack. All definitions are sourced directly from the specification and are free of behavioural or inferential semantics.</w:t>
       </w:r>
     </w:p>
     <w:p>
@@ -28728,13 +28398,7 @@
         <w:t>Domain Completeness</w:t>
       </w:r>
       <w:r>
-        <w:t xml:space="preserve"> This term is superseded by Profile Completeness in </w:t>
-      </w:r>
-      <w:r>
-        <w:t>v0.8.0</w:t>
-      </w:r>
-      <w:r>
-        <w:t>..</w:t>
+        <w:t xml:space="preserve"> This term is superseded by Profile Completeness in v0.8.0..</w:t>
       </w:r>
     </w:p>
     <w:p>
@@ -29702,13 +29366,7 @@
         <w:t>Profile Completeness</w:t>
       </w:r>
       <w:r>
-        <w:t xml:space="preserve"> The </w:t>
-      </w:r>
-      <w:r>
-        <w:t>v0.8.0</w:t>
-      </w:r>
-      <w:r>
-        <w:t xml:space="preserve"> invariant requiring that all domains declared by an artifact's implementation profile are present, and all out-of-profile domains are absent. Supersedes Domain Completeness.</w:t>
+        <w:t xml:space="preserve"> The v0.8.0 invariant requiring that all domains declared by an artifact's implementation profile are present, and all out-of-profile domains are absent. Supersedes Domain Completeness.</w:t>
       </w:r>
     </w:p>
     <w:p>
@@ -33956,6 +33614,7 @@
   <w:style w:type="character" w:default="1" w:styleId="DefaultParagraphFont">
     <w:name w:val="Default Paragraph Font"/>
     <w:uiPriority w:val="1"/>
+    <w:semiHidden/>
     <w:unhideWhenUsed/>
   </w:style>
   <w:style w:type="table" w:default="1" w:styleId="TableNormal">

</xml_diff>